<commit_message>
fix(paper): replace vertical diagrams with crisp horizontal 300-DPI publication flowcharts for Figs 1, 2, 3
</commit_message>
<xml_diff>
--- a/docs/paper/PaperV23_Ollama_Primary.docx
+++ b/docs/paper/PaperV23_Ollama_Primary.docx
@@ -12632,7 +12632,7 @@
       <w:r>
         <w:drawing>
           <ns4:inline>
-            <ns4:extent cx="5669280" cy="2677160"/>
+            <ns4:extent cx="5669280" cy="2572614"/>
             <ns4:docPr id="10" name="Picture 10"/>
             <ns4:cNvGraphicFramePr>
               <ns5:graphicFrameLocks noChangeAspect="1"/>
@@ -12641,11 +12641,11 @@
               <ns5:graphicData uri="http://schemas.openxmlformats.org/drawingml/2006/picture">
                 <ns6:pic>
                   <ns6:nvPicPr>
-                    <ns6:cNvPr id="0" name="image.png"/>
+                    <ns6:cNvPr id="0" name="image3.png"/>
                     <ns6:cNvPicPr/>
                   </ns6:nvPicPr>
                   <ns6:blipFill>
-                    <ns5:blip r:embed="rId9"/>
+                    <ns5:blip r:embed="rId20"/>
                     <ns5:stretch>
                       <ns5:fillRect/>
                     </ns5:stretch>
@@ -12653,7 +12653,7 @@
                   <ns6:spPr>
                     <ns5:xfrm>
                       <ns5:off x="0" y="0"/>
-                      <ns5:ext cx="5669280" cy="2677160"/>
+                      <ns5:ext cx="5669280" cy="2572614"/>
                     </ns5:xfrm>
                     <ns5:prstGeom prst="rect"/>
                   </ns6:spPr>
@@ -15415,7 +15415,7 @@
                     <ns6:cNvPicPr/>
                   </ns6:nvPicPr>
                   <ns6:blipFill>
-                    <ns5:blip r:embed="rId20"/>
+                    <ns5:blip r:embed="rId21"/>
                     <ns5:stretch>
                       <ns5:fillRect/>
                     </ns5:stretch>
@@ -15469,7 +15469,7 @@
                     <ns6:cNvPicPr/>
                   </ns6:nvPicPr>
                   <ns6:blipFill>
-                    <ns5:blip r:embed="rId21"/>
+                    <ns5:blip r:embed="rId22"/>
                     <ns5:stretch>
                       <ns5:fillRect/>
                     </ns5:stretch>
@@ -16574,7 +16574,7 @@
                     <ns6:cNvPicPr/>
                   </ns6:nvPicPr>
                   <ns6:blipFill>
-                    <ns5:blip r:embed="rId22"/>
+                    <ns5:blip r:embed="rId23"/>
                     <ns5:stretch>
                       <ns5:fillRect/>
                     </ns5:stretch>
@@ -16628,7 +16628,7 @@
                     <ns6:cNvPicPr/>
                   </ns6:nvPicPr>
                   <ns6:blipFill>
-                    <ns5:blip r:embed="rId23"/>
+                    <ns5:blip r:embed="rId24"/>
                     <ns5:stretch>
                       <ns5:fillRect/>
                     </ns5:stretch>
@@ -24616,7 +24616,7 @@
                     <ns6:cNvPicPr/>
                   </ns6:nvPicPr>
                   <ns6:blipFill>
-                    <ns5:blip r:embed="rId24"/>
+                    <ns5:blip r:embed="rId25"/>
                     <ns5:stretch>
                       <ns5:fillRect/>
                     </ns5:stretch>
@@ -24670,7 +24670,7 @@
                     <ns6:cNvPicPr/>
                   </ns6:nvPicPr>
                   <ns6:blipFill>
-                    <ns5:blip r:embed="rId25"/>
+                    <ns5:blip r:embed="rId26"/>
                     <ns5:stretch>
                       <ns5:fillRect/>
                     </ns5:stretch>

</xml_diff>

<commit_message>
fix(paper): fix figure blip relationships and export fresh PaperV23_Ollama_Primary_Final.pdf
</commit_message>
<xml_diff>
--- a/docs/paper/PaperV23_Ollama_Primary.docx
+++ b/docs/paper/PaperV23_Ollama_Primary.docx
@@ -5435,7 +5435,7 @@
       <w:r>
         <w:drawing>
           <ns4:inline>
-            <ns4:extent cx="1231738" cy="3291840"/>
+            <ns4:extent cx="5486400" cy="2926080"/>
             <ns4:docPr id="8" name="Picture 8"/>
             <ns4:cNvGraphicFramePr>
               <ns5:graphicFrameLocks noChangeAspect="1"/>
@@ -5456,7 +5456,7 @@
                   <ns6:spPr>
                     <ns5:xfrm>
                       <ns5:off x="0" y="0"/>
-                      <ns5:ext cx="1231738" cy="3291840"/>
+                      <ns5:ext cx="5486400" cy="2926080"/>
                     </ns5:xfrm>
                     <ns5:prstGeom prst="rect"/>
                   </ns6:spPr>
@@ -5502,7 +5502,7 @@
       <w:r>
         <w:drawing>
           <ns4:inline>
-            <ns4:extent cx="1135446" cy="3291840"/>
+            <ns4:extent cx="5486400" cy="2926080"/>
             <ns4:docPr id="9" name="Picture 9"/>
             <ns4:cNvGraphicFramePr>
               <ns5:graphicFrameLocks noChangeAspect="1"/>
@@ -5523,7 +5523,7 @@
                   <ns6:spPr>
                     <ns5:xfrm>
                       <ns5:off x="0" y="0"/>
-                      <ns5:ext cx="1135446" cy="3291840"/>
+                      <ns5:ext cx="5486400" cy="2926080"/>
                     </ns5:xfrm>
                     <ns5:prstGeom prst="rect"/>
                   </ns6:spPr>
@@ -12632,7 +12632,7 @@
       <w:r>
         <w:drawing>
           <ns4:inline>
-            <ns4:extent cx="5669280" cy="2572614"/>
+            <ns4:extent cx="5486400" cy="2926080"/>
             <ns4:docPr id="10" name="Picture 10"/>
             <ns4:cNvGraphicFramePr>
               <ns5:graphicFrameLocks noChangeAspect="1"/>
@@ -12653,7 +12653,7 @@
                   <ns6:spPr>
                     <ns5:xfrm>
                       <ns5:off x="0" y="0"/>
-                      <ns5:ext cx="5669280" cy="2572614"/>
+                      <ns5:ext cx="5486400" cy="2926080"/>
                     </ns5:xfrm>
                     <ns5:prstGeom prst="rect"/>
                   </ns6:spPr>
@@ -15402,7 +15402,7 @@
       <w:r>
         <w:drawing>
           <ns4:inline>
-            <ns4:extent cx="5094514" cy="3291840"/>
+            <ns4:extent cx="5486400" cy="2926080"/>
             <ns4:docPr id="11" name="Picture 11"/>
             <ns4:cNvGraphicFramePr>
               <ns5:graphicFrameLocks noChangeAspect="1"/>
@@ -15423,7 +15423,7 @@
                   <ns6:spPr>
                     <ns5:xfrm>
                       <ns5:off x="0" y="0"/>
-                      <ns5:ext cx="5094514" cy="3291840"/>
+                      <ns5:ext cx="5486400" cy="2926080"/>
                     </ns5:xfrm>
                     <ns5:prstGeom prst="rect"/>
                   </ns6:spPr>
@@ -15456,7 +15456,7 @@
       <w:r>
         <w:drawing>
           <ns4:inline>
-            <ns4:extent cx="5094514" cy="3291840"/>
+            <ns4:extent cx="5486400" cy="2926080"/>
             <ns4:docPr id="12" name="Picture 12"/>
             <ns4:cNvGraphicFramePr>
               <ns5:graphicFrameLocks noChangeAspect="1"/>
@@ -15477,7 +15477,7 @@
                   <ns6:spPr>
                     <ns5:xfrm>
                       <ns5:off x="0" y="0"/>
-                      <ns5:ext cx="5094514" cy="3291840"/>
+                      <ns5:ext cx="5486400" cy="2926080"/>
                     </ns5:xfrm>
                     <ns5:prstGeom prst="rect"/>
                   </ns6:spPr>
@@ -16561,7 +16561,7 @@
       <w:r>
         <w:drawing>
           <ns4:inline>
-            <ns4:extent cx="5303520" cy="2969971"/>
+            <ns4:extent cx="5486400" cy="2926080"/>
             <ns4:docPr id="13" name="Picture 13"/>
             <ns4:cNvGraphicFramePr>
               <ns5:graphicFrameLocks noChangeAspect="1"/>
@@ -16582,7 +16582,7 @@
                   <ns6:spPr>
                     <ns5:xfrm>
                       <ns5:off x="0" y="0"/>
-                      <ns5:ext cx="5303520" cy="2969971"/>
+                      <ns5:ext cx="5486400" cy="2926080"/>
                     </ns5:xfrm>
                     <ns5:prstGeom prst="rect"/>
                   </ns6:spPr>
@@ -16615,7 +16615,7 @@
       <w:r>
         <w:drawing>
           <ns4:inline>
-            <ns4:extent cx="5266944" cy="3291840"/>
+            <ns4:extent cx="5486400" cy="2926080"/>
             <ns4:docPr id="14" name="Picture 14"/>
             <ns4:cNvGraphicFramePr>
               <ns5:graphicFrameLocks noChangeAspect="1"/>
@@ -16636,7 +16636,7 @@
                   <ns6:spPr>
                     <ns5:xfrm>
                       <ns5:off x="0" y="0"/>
-                      <ns5:ext cx="5266944" cy="3291840"/>
+                      <ns5:ext cx="5486400" cy="2926080"/>
                     </ns5:xfrm>
                     <ns5:prstGeom prst="rect"/>
                   </ns6:spPr>
@@ -24603,7 +24603,7 @@
       <w:r>
         <w:drawing>
           <ns4:inline>
-            <ns4:extent cx="5669280" cy="1873327"/>
+            <ns4:extent cx="5486400" cy="2926080"/>
             <ns4:docPr id="15" name="Picture 15"/>
             <ns4:cNvGraphicFramePr>
               <ns5:graphicFrameLocks noChangeAspect="1"/>
@@ -24624,7 +24624,7 @@
                   <ns6:spPr>
                     <ns5:xfrm>
                       <ns5:off x="0" y="0"/>
-                      <ns5:ext cx="5669280" cy="1873327"/>
+                      <ns5:ext cx="5486400" cy="2926080"/>
                     </ns5:xfrm>
                     <ns5:prstGeom prst="rect"/>
                   </ns6:spPr>
@@ -24657,7 +24657,7 @@
       <w:r>
         <w:drawing>
           <ns4:inline>
-            <ns4:extent cx="5669280" cy="1873327"/>
+            <ns4:extent cx="5486400" cy="2926080"/>
             <ns4:docPr id="16" name="Picture 16"/>
             <ns4:cNvGraphicFramePr>
               <ns5:graphicFrameLocks noChangeAspect="1"/>
@@ -24678,7 +24678,7 @@
                   <ns6:spPr>
                     <ns5:xfrm>
                       <ns5:off x="0" y="0"/>
-                      <ns5:ext cx="5669280" cy="1873327"/>
+                      <ns5:ext cx="5486400" cy="2926080"/>
                     </ns5:xfrm>
                     <ns5:prstGeom prst="rect"/>
                   </ns6:spPr>

</xml_diff>